<commit_message>
fix: correct idle tracking and sanitize documentation
</commit_message>
<xml_diff>
--- a/Documentacion_RiskManager_v2.docx
+++ b/Documentacion_RiskManager_v2.docx
@@ -40,18 +40,15 @@
         <w:rPr>
           <w:b/>
         </w:rPr>
-        <w:t>Proyecto:</w:t>
+        <w:t>Proyecto Firebase: configurado por entorno</w:t>
       </w:r>
-      <w:r>
-        <w:t xml:space="preserve"> </w:t>
-      </w:r>
+      <w:r/>
       <w:r>
         <w:rPr>
           <w:rFonts w:ascii="Consolas" w:hAnsi="Consolas"/>
           <w:color w:val="B91C1C"/>
           <w:sz w:val="19"/>
         </w:rPr>
-        <w:t>riskops-75637</w:t>
       </w:r>
       <w:r>
         <w:t xml:space="preserve"> · </w:t>
@@ -60,17 +57,14 @@
         <w:rPr>
           <w:b/>
         </w:rPr>
-        <w:t>URL:</w:t>
+        <w:t>URL de Hosting: configurada por entorno</w:t>
       </w:r>
-      <w:r>
-        <w:t xml:space="preserve"> </w:t>
-      </w:r>
+      <w:r/>
       <w:r>
         <w:rPr>
           <w:color w:val="2563EB"/>
           <w:u w:val="single"/>
         </w:rPr>
-        <w:t>riskops-75637.web.app</w:t>
       </w:r>
       <w:r>
         <w:t xml:space="preserve"> · </w:t>
@@ -1863,15 +1857,15 @@
               </w:rPr>
               <w:t>// firebase-config.js</w:t>
               <w:br/>
-              <w:t>apiKey: "AIzaSyBj...",</w:t>
+              <w:t>apiKey: "&lt;FIREBASE_API_KEY&gt;",</w:t>
               <w:br/>
-              <w:t>authDomain: "riskops-75637.firebaseapp.com",</w:t>
+              <w:t>authDomain: "&lt;FIREBASE_AUTH_DOMAIN&gt;",</w:t>
               <w:br/>
-              <w:t>databaseURL: "https://riskops-75637-default-rtdb.firebaseio.com",</w:t>
+              <w:t>databaseURL: "&lt;FIREBASE_DATABASE_URL&gt;",</w:t>
               <w:br/>
-              <w:t>projectId: "riskops-75637",</w:t>
+              <w:t>projectId: "&lt;FIREBASE_PROJECT_ID&gt;",</w:t>
               <w:br/>
-              <w:t>appId: "1:874205588056:web:95eb04536fd4586e26b82d"</w:t>
+              <w:t>appId: "&lt;FIREBASE_APP_ID&gt;"</w:t>
             </w:r>
           </w:p>
         </w:tc>
@@ -5379,11 +5373,9 @@
         <w:rPr>
           <w:b/>
         </w:rPr>
-        <w:t>Idle Detector API</w:t>
+        <w:t>Idle Detector API: Detecta inactividad general del equipo y bloqueo de pantalla durante más de 3 minutos; se activa desde Habilitar Permiso. El fallback DOM solo evalúa 5 minutos sin interacción con RiskOps visible y enfocado; cambiar de pestaña o ventana no genera inactividad.</w:t>
       </w:r>
-      <w:r>
-        <w:t>: Detecta bloqueo de pantalla y cambio de pestaña &gt; 5 minutos</w:t>
-      </w:r>
+      <w:r/>
     </w:p>
     <w:p>
       <w:pPr>
@@ -5510,9 +5502,9 @@
               <w:t>npx firebase-tools deploy --only hosting</w:t>
               <w:br/>
               <w:br/>
-              <w:t># Proyecto: riskops-75637</w:t>
+              <w:t># Proyecto Firebase: configurado por entorno</w:t>
               <w:br/>
-              <w:t># URL: https://riskops-75637.web.app</w:t>
+              <w:t># URL: definida por el entorno de despliegue</w:t>
             </w:r>
           </w:p>
         </w:tc>

</xml_diff>

<commit_message>
fix: correct idle tracking and sanitize documentation (#10)
</commit_message>
<xml_diff>
--- a/Documentacion_RiskManager_v2.docx
+++ b/Documentacion_RiskManager_v2.docx
@@ -40,18 +40,15 @@
         <w:rPr>
           <w:b/>
         </w:rPr>
-        <w:t>Proyecto:</w:t>
+        <w:t>Proyecto Firebase: configurado por entorno</w:t>
       </w:r>
-      <w:r>
-        <w:t xml:space="preserve"> </w:t>
-      </w:r>
+      <w:r/>
       <w:r>
         <w:rPr>
           <w:rFonts w:ascii="Consolas" w:hAnsi="Consolas"/>
           <w:color w:val="B91C1C"/>
           <w:sz w:val="19"/>
         </w:rPr>
-        <w:t>riskops-75637</w:t>
       </w:r>
       <w:r>
         <w:t xml:space="preserve"> · </w:t>
@@ -60,17 +57,14 @@
         <w:rPr>
           <w:b/>
         </w:rPr>
-        <w:t>URL:</w:t>
+        <w:t>URL de Hosting: configurada por entorno</w:t>
       </w:r>
-      <w:r>
-        <w:t xml:space="preserve"> </w:t>
-      </w:r>
+      <w:r/>
       <w:r>
         <w:rPr>
           <w:color w:val="2563EB"/>
           <w:u w:val="single"/>
         </w:rPr>
-        <w:t>riskops-75637.web.app</w:t>
       </w:r>
       <w:r>
         <w:t xml:space="preserve"> · </w:t>
@@ -1863,15 +1857,15 @@
               </w:rPr>
               <w:t>// firebase-config.js</w:t>
               <w:br/>
-              <w:t>apiKey: "AIzaSyBj...",</w:t>
+              <w:t>apiKey: "&lt;FIREBASE_API_KEY&gt;",</w:t>
               <w:br/>
-              <w:t>authDomain: "riskops-75637.firebaseapp.com",</w:t>
+              <w:t>authDomain: "&lt;FIREBASE_AUTH_DOMAIN&gt;",</w:t>
               <w:br/>
-              <w:t>databaseURL: "https://riskops-75637-default-rtdb.firebaseio.com",</w:t>
+              <w:t>databaseURL: "&lt;FIREBASE_DATABASE_URL&gt;",</w:t>
               <w:br/>
-              <w:t>projectId: "riskops-75637",</w:t>
+              <w:t>projectId: "&lt;FIREBASE_PROJECT_ID&gt;",</w:t>
               <w:br/>
-              <w:t>appId: "1:874205588056:web:95eb04536fd4586e26b82d"</w:t>
+              <w:t>appId: "&lt;FIREBASE_APP_ID&gt;"</w:t>
             </w:r>
           </w:p>
         </w:tc>
@@ -5379,11 +5373,9 @@
         <w:rPr>
           <w:b/>
         </w:rPr>
-        <w:t>Idle Detector API</w:t>
+        <w:t>Idle Detector API: Detecta inactividad general del equipo y bloqueo de pantalla durante más de 3 minutos; se activa desde Habilitar Permiso. El fallback DOM solo evalúa 5 minutos sin interacción con RiskOps visible y enfocado; cambiar de pestaña o ventana no genera inactividad.</w:t>
       </w:r>
-      <w:r>
-        <w:t>: Detecta bloqueo de pantalla y cambio de pestaña &gt; 5 minutos</w:t>
-      </w:r>
+      <w:r/>
     </w:p>
     <w:p>
       <w:pPr>
@@ -5510,9 +5502,9 @@
               <w:t>npx firebase-tools deploy --only hosting</w:t>
               <w:br/>
               <w:br/>
-              <w:t># Proyecto: riskops-75637</w:t>
+              <w:t># Proyecto Firebase: configurado por entorno</w:t>
               <w:br/>
-              <w:t># URL: https://riskops-75637.web.app</w:t>
+              <w:t># URL: definida por el entorno de despliegue</w:t>
             </w:r>
           </w:p>
         </w:tc>

</xml_diff>